<commit_message>
feat: bundled resume renderer for consistent template output
- skills/job-fit-assistant/scripts/render_resume.py renders confirmed
  JSON content into the four templates, verifies every string is present
  and ordered, and exports PDF with a page count when LibreOffice exists
- Samples are rebuilt from sample-resume.json by the same renderer
- Compact template warns to deliver PDF (white name on coloured band)
- Clarify that the Skill runs only its own bundled script

Co-Authored-By: Claude Opus 5.5 (1M context) <noreply@anthropic.com>
</commit_message>
<xml_diff>
--- a/skills/job-fit-assistant/assets/resume-templates/ats-minimal.docx
+++ b/skills/job-fit-assistant/assets/resume-templates/ats-minimal.docx
@@ -68,7 +68,7 @@
     <w:p>
       <w:pPr>
         <w:keepNext w:val="0"/>
-        <w:spacing w:before="0" w:after="40" w:line="276" w:lineRule="auto"/>
+        <w:spacing w:before="0" w:after="50" w:line="276" w:lineRule="auto"/>
       </w:pPr>
       <w:r>
         <w:rPr>
@@ -101,16 +101,8 @@
     <w:p>
       <w:pPr>
         <w:keepNext w:val="0"/>
-        <w:spacing w:before="0" w:after="24" w:line="240" w:lineRule="auto"/>
+        <w:spacing w:before="0" w:after="24" w:line="259" w:lineRule="auto"/>
       </w:pPr>
-      <w:r>
-        <w:rPr>
-          <w:rFonts w:ascii="Arial" w:hAnsi="Arial" w:eastAsia="Microsoft YaHei"/>
-          <w:b w:val="0"/>
-          <w:color w:val="20242A"/>
-          <w:sz w:val="20"/>
-        </w:rPr>
-      </w:r>
       <w:r>
         <w:rPr>
           <w:rFonts w:ascii="Arial" w:hAnsi="Arial" w:eastAsia="Microsoft YaHei"/>
@@ -124,7 +116,7 @@
         <w:rPr>
           <w:rFonts w:ascii="Arial" w:hAnsi="Arial" w:eastAsia="Microsoft YaHei"/>
           <w:b w:val="0"/>
-          <w:color w:val="111111"/>
+          <w:color w:val="20242A"/>
           <w:sz w:val="20"/>
         </w:rPr>
         <w:t>SQL、Excel、Looker Studio、漏斗分析</w:t>
@@ -133,16 +125,8 @@
     <w:p>
       <w:pPr>
         <w:keepNext w:val="0"/>
-        <w:spacing w:before="0" w:after="24" w:line="240" w:lineRule="auto"/>
+        <w:spacing w:before="0" w:after="24" w:line="259" w:lineRule="auto"/>
       </w:pPr>
-      <w:r>
-        <w:rPr>
-          <w:rFonts w:ascii="Arial" w:hAnsi="Arial" w:eastAsia="Microsoft YaHei"/>
-          <w:b w:val="0"/>
-          <w:color w:val="20242A"/>
-          <w:sz w:val="20"/>
-        </w:rPr>
-      </w:r>
       <w:r>
         <w:rPr>
           <w:rFonts w:ascii="Arial" w:hAnsi="Arial" w:eastAsia="Microsoft YaHei"/>
@@ -156,7 +140,7 @@
         <w:rPr>
           <w:rFonts w:ascii="Arial" w:hAnsi="Arial" w:eastAsia="Microsoft YaHei"/>
           <w:b w:val="0"/>
-          <w:color w:val="111111"/>
+          <w:color w:val="20242A"/>
           <w:sz w:val="20"/>
         </w:rPr>
         <w:t>onboarding 优化、A/B 测试、用户访谈、社群运营</w:t>
@@ -165,16 +149,8 @@
     <w:p>
       <w:pPr>
         <w:keepNext w:val="0"/>
-        <w:spacing w:before="0" w:after="24" w:line="240" w:lineRule="auto"/>
+        <w:spacing w:before="0" w:after="24" w:line="259" w:lineRule="auto"/>
       </w:pPr>
-      <w:r>
-        <w:rPr>
-          <w:rFonts w:ascii="Arial" w:hAnsi="Arial" w:eastAsia="Microsoft YaHei"/>
-          <w:b w:val="0"/>
-          <w:color w:val="20242A"/>
-          <w:sz w:val="20"/>
-        </w:rPr>
-      </w:r>
       <w:r>
         <w:rPr>
           <w:rFonts w:ascii="Arial" w:hAnsi="Arial" w:eastAsia="Microsoft YaHei"/>
@@ -188,7 +164,7 @@
         <w:rPr>
           <w:rFonts w:ascii="Arial" w:hAnsi="Arial" w:eastAsia="Microsoft YaHei"/>
           <w:b w:val="0"/>
-          <w:color w:val="111111"/>
+          <w:color w:val="20242A"/>
           <w:sz w:val="20"/>
         </w:rPr>
         <w:t>需求文档、埋点验收、跨团队推进、AI 回答质量评测</w:t>
@@ -216,7 +192,7 @@
       <w:pPr>
         <w:keepNext/>
         <w:tabs>
-          <w:tab w:pos="9184" w:val="right"/>
+          <w:tab w:pos="9865" w:val="right"/>
         </w:tabs>
         <w:spacing w:before="50" w:after="4" w:line="240" w:lineRule="auto"/>
       </w:pPr>
@@ -251,6 +227,7 @@
     </w:p>
     <w:p>
       <w:pPr>
+        <w:keepNext w:val="0"/>
         <w:spacing w:before="0" w:after="32" w:line="264" w:lineRule="auto"/>
         <w:ind w:left="255" w:hanging="204"/>
       </w:pPr>
@@ -275,6 +252,7 @@
     </w:p>
     <w:p>
       <w:pPr>
+        <w:keepNext w:val="0"/>
         <w:spacing w:before="0" w:after="32" w:line="264" w:lineRule="auto"/>
         <w:ind w:left="255" w:hanging="204"/>
       </w:pPr>
@@ -299,6 +277,7 @@
     </w:p>
     <w:p>
       <w:pPr>
+        <w:keepNext w:val="0"/>
         <w:spacing w:before="0" w:after="32" w:line="264" w:lineRule="auto"/>
         <w:ind w:left="255" w:hanging="204"/>
       </w:pPr>
@@ -325,7 +304,7 @@
       <w:pPr>
         <w:keepNext/>
         <w:tabs>
-          <w:tab w:pos="9184" w:val="right"/>
+          <w:tab w:pos="9865" w:val="right"/>
         </w:tabs>
         <w:spacing w:before="50" w:after="4" w:line="240" w:lineRule="auto"/>
       </w:pPr>
@@ -360,6 +339,7 @@
     </w:p>
     <w:p>
       <w:pPr>
+        <w:keepNext w:val="0"/>
         <w:spacing w:before="0" w:after="32" w:line="264" w:lineRule="auto"/>
         <w:ind w:left="255" w:hanging="204"/>
       </w:pPr>
@@ -384,6 +364,7 @@
     </w:p>
     <w:p>
       <w:pPr>
+        <w:keepNext w:val="0"/>
         <w:spacing w:before="0" w:after="32" w:line="264" w:lineRule="auto"/>
         <w:ind w:left="255" w:hanging="204"/>
       </w:pPr>
@@ -428,7 +409,7 @@
       <w:pPr>
         <w:keepNext/>
         <w:tabs>
-          <w:tab w:pos="9184" w:val="right"/>
+          <w:tab w:pos="9865" w:val="right"/>
         </w:tabs>
         <w:spacing w:before="50" w:after="4" w:line="240" w:lineRule="auto"/>
       </w:pPr>
@@ -463,7 +444,8 @@
     </w:p>
     <w:p>
       <w:pPr>
-        <w:spacing w:before="0" w:after="28" w:line="264" w:lineRule="auto"/>
+        <w:keepNext w:val="0"/>
+        <w:spacing w:before="0" w:after="32" w:line="264" w:lineRule="auto"/>
         <w:ind w:left="255" w:hanging="204"/>
       </w:pPr>
       <w:r>
@@ -487,7 +469,8 @@
     </w:p>
     <w:p>
       <w:pPr>
-        <w:spacing w:before="0" w:after="28" w:line="264" w:lineRule="auto"/>
+        <w:keepNext w:val="0"/>
+        <w:spacing w:before="0" w:after="32" w:line="264" w:lineRule="auto"/>
         <w:ind w:left="255" w:hanging="204"/>
       </w:pPr>
       <w:r>
@@ -531,7 +514,7 @@
       <w:pPr>
         <w:keepNext/>
         <w:tabs>
-          <w:tab w:pos="9184" w:val="right"/>
+          <w:tab w:pos="9865" w:val="right"/>
         </w:tabs>
         <w:spacing w:before="50" w:after="4" w:line="240" w:lineRule="auto"/>
       </w:pPr>

</xml_diff>